<commit_message>
docs(research): update PaperV50 formatting in Table 12 and Appendix B
</commit_message>
<xml_diff>
--- a/PaperV50.docx
+++ b/PaperV50.docx
@@ -488,7 +488,7 @@
           <w:szCs w:val="20"/>
           <w:rtl w:val="0"/>
         </w:rPr>
-        <w:t xml:space="preserve">5. We propose a robustness framework for optical quality profiles by defining a systematic evaluation matrix for four standardized optical quality profiles (clean, scanner_copy, mobile_camera, rotated_90) to quantify the decay of the model under controlled physical and optical capture distortions.</w:t>
+        <w:t>5. We propose a robustness framework for optical quality profiles by defining a systematic evaluation matrix for four standardized optical quality profiles (clean, scanner copy, mobile camera, rotated 90) to quantify the decay of the model under controlled physical and optical capture distortions.</w:t>
       </w:r>
     </w:p>
     <w:p>
@@ -3859,7 +3859,7 @@
           <w:szCs w:val="20"/>
           <w:rtl w:val="0"/>
         </w:rPr>
-        <w:t>The proposed research methodology provides an end-to-end, privacy preserving and reproducible reference framework for automatic academic document intelligence and standardized reference evaluation. The framework meets statutory privacy and data protection obligations (including FERPA and GDPR) which place significant restrictions on the distribution of identifiable educational records by means of the Academic Document Benchmark Generator (ADBG v1.0) [32]. ADBG v1.0 uses a seed-deterministic generation engine and a Typst vector compilation backend, to print high-resolution synthetic document specimens, representing three representative classes of academic documents: degree certificates, semester marksheets (with dense multi-column tabular course arrays), and student identification cards of institutions. The pipeline is designed to degrade the images according to the following 14 physical optical effects on the four standardized quality profiles: ‘clean', ‘scanner_copy', ‘mobile_camera', and ‘rotated_90' [33] to create pixel-exact ground-truth JSON annotations and schema metadata for each specimen, for evaluating extraction robustness under real-world capture conditions. The resulting benchmark suite ('AU_DIC_Benchmark_v1.0') is then fed to the Academic Universe Document Intelligence Comparator (AU DIC) evaluation subsystem which runs headless in read-only mode ('isReadOnly: true') [34]. The evaluation engine activates the neural model prediction adapters, passes both raw and expected entities through a six stage semantic canonical normalization ('CanonicalNormalizer') [35] to identify superficial formatting discrepancies, and performs the categorisation of discrepancies taking place via a structured nine-class OCR error diagnosis taxonomy [36] to produce extensive statistical evaluation artefacts without altering production data stores. The overarching multi-component system architecture of the framework is illustrated in Fig. 1.</w:t>
+        <w:t>The proposed research methodology provides an end-to-end, privacy preserving and reproducible reference framework for automatic academic document intelligence and standardized reference evaluation. The framework meets statutory privacy and data protection obligations (including FERPA and GDPR) which place significant restrictions on the distribution of identifiable educational records by means of the Academic Document Benchmark Generator (ADBG v1.0) [32]. ADBG v1.0 uses a seed-deterministic generation engine and a Typst vector compilation backend, to print high-resolution synthetic document specimens, representing three representative classes of academic documents: degree certificates, semester marksheets (with dense multi-column tabular course arrays), and student identification cards of institutions. The pipeline is designed to degrade the images according to the following 14 physical optical effects on the four standardized quality profiles: ‘clean', ‘scanner copy', ‘mobile camera', and ‘rotated 90' [33] to create pixel-exact ground-truth JSON annotations and schema metadata for each specimen, for evaluating extraction robustness under real-world capture conditions. The resulting benchmark suite ('AU DIC Benchmark v1.0') is then fed to the Academic Universe Document Intelligence Comparator (AU DIC) evaluation subsystem which runs headless in read-only mode ('isReadOnly: true') [34]. The evaluation engine activates the neural model prediction adapters, passes both raw and expected entities through a six stage semantic canonical normalization ('CanonicalNormalizer') [35] to identify superficial formatting discrepancies, and performs the categorisation of discrepancies taking place via a structured nine-class OCR error diagnosis taxonomy [36] to produce extensive statistical evaluation artefacts without altering production data stores. The overarching multi-component system architecture of the framework is illustrated in Fig. 1.</w:t>
       </w:r>
     </w:p>
     <w:p>
@@ -3961,7 +3961,7 @@
           <w:szCs w:val="20"/>
           <w:rtl w:val="0"/>
         </w:rPr>
-        <w:t xml:space="preserve">The two operational subsystems in the system architecture shown in Fig. 1 are the ADBG Synthetic Document Generation Subsystem and the AU DIC Benchmark Evaluation Subsystem, which are two operationally decoupled subsystems. This separation of concerns results in full architectural separation between the generation process and the benchmark evaluation process that ensures that the evaluation processes are independent of generation internals and that the test-set data is not leaked. ADBG subsystem consists of a pseudo-random seed generator ('PrngSeedGenerator') responsible for setting-up parameters of credential entity to support reproducible creation with reproducible instances of a brand new PDF specimen, paired ground-truth JSON files and metadata records. The optical degradation processor converts a vector document into image tensors and runs transformation pipelines to create specimens for the four different profiles – ‘clean', ‘scanner_copy', ‘mobile_camera', ‘rotated_90' – to build the full ‘AU_DIC_Benchmark_v1.0' benchmark store. The AU DIC 'BenchmarkRunner' loads document images in a headless read-only mode and sends them to neural document analysis prediction adapters (e.g., local Ollama runtimes, vision-language models). The 'CanonicalNormalizer' transforms the text predictions and expected ground truth values simultaneously, going through six sequential transformation steps, which normalize case, whitespace, ISO-8601 dates, roll numbers, numerical precision, institutional aliases, and honorifics. The 'ErrorTaxonomist' compares the normalized candidate pairs to the nine-class error taxonomy, and calculates the F1 score at each of the fields, character error rates, and classification accuracy; it also outputs immutable benchmark evaluation reports ('ErrorTaxonomist.metrics.json', 'ErrorTaxonomist.predictions.json', and 'ErrorTaxonomist.comparisons.json').</w:t>
+        <w:t>The two operational subsystems in the system architecture shown in Fig. 1 are the ADBG Synthetic Document Generation Subsystem and the AU DIC Benchmark Evaluation Subsystem, which are two operationally decoupled subsystems. This separation of concerns results in full architectural separation between the generation process and the benchmark evaluation process that ensures that the evaluation processes are independent of generation internals and that the test-set data is not leaked. ADBG subsystem consists of a pseudo-random seed generator ('PrngSeedGenerator') responsible for setting-up parameters of credential entity to support reproducible creation with reproducible instances of a brand new PDF specimen, paired ground-truth JSON files and metadata records. The optical degradation processor converts a vector document into image tensors and runs transformation pipelines to create specimens for the four different profiles – ‘clean', ‘scanner copy', ‘mobile camera', ‘rotated 90' – to build the full ‘AU DIC Benchmark v1.0' benchmark store. The AU DIC 'BenchmarkRunner' loads document images in a headless read-only mode and sends them to neural document analysis prediction adapters (e.g., local Ollama runtimes, vision-language models). The 'CanonicalNormalizer' transforms the text predictions and expected ground truth values simultaneously, going through six sequential transformation steps, which normalize case, whitespace, ISO-8601 dates, roll numbers, numerical precision, institutional aliases, and honorifics. The 'ErrorTaxonomist' compares the normalized candidate pairs to the nine-class error taxonomy, and calculates the F1 score at each of the fields, character error rates, and classification accuracy; it also outputs immutable benchmark evaluation reports ('ErrorTaxonomist.metrics.json', 'ErrorTaxonomist.predictions.json', and 'ErrorTaxonomist.comparisons.json').</w:t>
       </w:r>
     </w:p>
     <w:p>
@@ -3981,7 +3981,7 @@
           <w:szCs w:val="20"/>
           <w:rtl w:val="0"/>
         </w:rPr>
-        <w:t xml:space="preserve">The end-to-end data transformation lifecycle, from seed configuration to final publication of the statistical artifacts, in both subsystems is strictly defined and deterministic. The data journey begins with configuration seeds and schema specifications to guide the synthetic data generator to produce structured academic credential data. The Typst compiler converts these records to a vector PDF version and also compiles matching ground-truth JSON versions with field-level bounding boxes and expected text. The high-resolution rasterization creates digital bitmap tensors that traverse the optical degradation matrix to create degraded image specimens that are stored in the benchmark repository. The specimen image, ground-truth JSON and metadata are streamed to the AU DIC evaluation engine for the model prediction adapter to perform inference and generate a raw extracted JSON output payload for evaluation. The raw prediction string (V̂) and ground-truth string (V_GT) are input to the six-stage ‘CanonicalNormalizer’ at the same time, and get canonicalized representations (C(V̂) and C(V_GT)). A candidate comparator performs exact string and canonical matching: if they do not match, the automated diagnostic taxonomist classifies the failure into distinct error classes (for example: 'OCR_ERROR', 'FIELD_MISSING', 'HALLUCINATION', 'NORMALIZATION_ERROR'). Lastly, quantitative aggregation modules perform macro-averaged precision, recall, F1, Character Error Rate (CER), Word Error Rate (WER), and joint exact match rates and deliver structured evaluation payloads and publication-ready audit logs.</w:t>
+        <w:t>The end-to-end data transformation lifecycle, from seed configuration to final publication of the statistical artifacts, in both subsystems is strictly defined and deterministic. The data journey begins with configuration seeds and schema specifications to guide the synthetic data generator to produce structured academic credential data. The Typst compiler converts these records to a vector PDF version and also compiles matching ground-truth JSON versions with field-level bounding boxes and expected text. The high-resolution rasterization creates digital bitmap tensors that traverse the optical degradation matrix to create degraded image specimens that are stored in the benchmark repository. The specimen image, ground-truth JSON and metadata are streamed to the AU DIC evaluation engine for the model prediction adapter to perform inference and generate a raw extracted JSON output payload for evaluation. The raw prediction string (V̂) and ground-truth string (V_GT) are input to the six-stage ‘CanonicalNormalizer’ at the same time, and get canonicalized representations (C(V̂) and C(V_GT)). A candidate comparator performs exact string and canonical matching: if they do not match, the automated diagnostic taxonomist classifies the failure into distinct error classes (for example: 'OCR ERROR', 'FIELD MISSING', 'HALLUCINATION', 'NORMALIZATION ERROR'). Lastly, quantitative aggregation modules perform macro-averaged precision, recall, F1, Character Error Rate (CER), Word Error Rate (WER), and joint exact match rates and deliver structured evaluation payloads and publication-ready audit logs.</w:t>
       </w:r>
     </w:p>
     <w:p>
@@ -5146,7 +5146,7 @@
           <w:szCs w:val="20"/>
           <w:rtl w:val="0"/>
         </w:rPr>
-        <w:t xml:space="preserve">The evaluation benchmark suite (AU_DIC_Benchmark_v1.0) consists of 450 synthetic multi-modal academic credential specimens that span a variety of physical and optical capture conditions for each of three major categories of academic documents in higher education: Academic Certificates, Semester Marksheets, and Student Identity Cards. The benchmark dataset includes a mix of complementary PDF representations: Vector PDFs (50 specimens rendered directly from a vector layout stream), Lossless PNG Scans (200 specimens scanned using a clean scanner and with the mobile camera, and 90° rotated), Compressed JPEGs (200 specimens scanned with a clean scanner and rotated 90°, captured by the mobile camera). The composition of the multi-modal data set is given in Table 3 and the physical and optical degradation parameters are summarized in Table 4.</w:t>
+        <w:t>The evaluation benchmark suite (AU DIC Benchmark v1.0) consists of 450 synthetic multi-modal academic credential specimens that span a variety of physical and optical capture conditions for each of three major categories of academic documents in higher education: Academic Certificates, Semester Marksheets, and Student Identity Cards. The benchmark dataset includes a mix of complementary PDF representations: Vector PDFs (50 specimens rendered directly from a vector layout stream), Lossless PNG Scans (200 specimens scanned using a clean scanner and with the mobile camera, and 90° rotated), Compressed JPEGs (200 specimens scanned with a clean scanner and rotated 90°, captured by the mobile camera). The composition of the multi-modal data set is given in Table 3 and the physical and optical degradation parameters are summarized in Table 4.</w:t>
       </w:r>
     </w:p>
     <w:p>
@@ -5168,7 +5168,7 @@
           <w:szCs w:val="20"/>
           <w:rtl w:val="0"/>
         </w:rPr>
-        <w:t xml:space="preserve">TABLE 3: MULTI-MODAL DATASET AND BENCHMARK COMPOSITION(AU_DIC_BENCHMARK_V1.0)</w:t>
+        <w:t>TABLE 3: MULTI-MODAL DATASET AND BENCHMARK COMPOSITION(AU DIC BENCHMARK V1.0)</w:t>
       </w:r>
       <w:r>
         <w:rPr>
@@ -6662,7 +6662,7 @@
                 <w:szCs w:val="16"/>
                 <w:rtl w:val="0"/>
               </w:rPr>
-              <w:t xml:space="preserve">scanner_copy</w:t>
+              <w:t>scanner copy</w:t>
             </w:r>
             <w:r>
               <w:rPr>
@@ -6824,7 +6824,7 @@
                 <w:szCs w:val="16"/>
                 <w:rtl w:val="0"/>
               </w:rPr>
-              <w:t xml:space="preserve">mobile_camera</w:t>
+              <w:t>mobile camera</w:t>
             </w:r>
             <w:r>
               <w:rPr>
@@ -6985,7 +6985,7 @@
                 <w:szCs w:val="16"/>
                 <w:rtl w:val="0"/>
               </w:rPr>
-              <w:t xml:space="preserve">rotated_90</w:t>
+              <w:t>rotated 90</w:t>
             </w:r>
             <w:r>
               <w:rPr>
@@ -9022,7 +9022,7 @@
           <w:szCs w:val="20"/>
           <w:rtl w:val="0"/>
         </w:rPr>
-        <w:t>The execution lifecycle of the experimental evaluation protocol follows a standardized, end-to-end multi-phase workflow. In the first phase of credential synthesis and dataset generation, a pseudo-random seed generator (PrngSeedGenerator, seed = 42) initializes realistic, privacy-compliant credential entity values across academic certificate, marksheet, and student identity templates. These structured entities are subsequently compiled into high-resolution pristine vector PDF documents via TypstCompilerAdapter, while pixel-precise bounding boxes, entity keys, and ground-truth text strings are assembled into accompanying ground-truth JSON and metadata descriptors. To model real-world capture variability, an optical degradation pipeline applies 14 physical and optical transformation operators to the rasterized bitmap tensors across four standard profiles (clean, scanner_copy, mobile_camera, and rotated_90). The resulting 450 multi-modal document specimens—comprising 50 vector PDFs, 200 lossless PNGs, and 200 compressed JPEGs—along with their corresponding ground-truth annotations, are bundled into the benchmark repository (AU_DIC_Benchmark_v1.0).</w:t>
+        <w:t>The execution lifecycle of the experimental evaluation protocol follows a standardized, end-to-end multi-phase workflow. In the first phase of credential synthesis and dataset generation, a pseudo-random seed generator (PrngSeedGenerator, seed = 42) initializes realistic, privacy-compliant credential entity values across academic certificate, marksheet, and student identity templates. These structured entities are subsequently compiled into high-resolution pristine vector PDF documents via TypstCompilerAdapter, while pixel-precise bounding boxes, entity keys, and ground-truth text strings are assembled into accompanying ground-truth JSON and metadata descriptors. To model real-world capture variability, an optical degradation pipeline applies 14 physical and optical transformation operators to the rasterized bitmap tensors across four standard profiles (clean, scanner copy, mobile camera, and rotated 90). The resulting 450 multi-modal document specimens—comprising 50 vector PDFs, 200 lossless PNGs, and 200 compressed JPEGs—along with their corresponding ground-truth annotations, are bundled into the benchmark repository (AU DIC Benchmark v1.0).</w:t>
       </w:r>
     </w:p>
     <w:p>
@@ -17160,7 +17160,7 @@
           <w:szCs w:val="20"/>
           <w:rtl w:val="0"/>
         </w:rPr>
-        <w:t xml:space="preserve">To facilitate independent scientific verification and benchmark replication, all code, benchmark configurations, and evaluation artifacts are preserved under open-access version control. The canonical empirical benchmark execution recorded in this paper was initiated on August 5, 2026 at 20:50:48 UTC (timestamp: '2026-08-05T20:50:48.067Z', total execution duration: 3874.16s / 64.57 mins) under run identifier 'run_1785959173886'. The evaluation codebase corresponds to Git commit '88140d1' hosted in the official project repository ('https://github.com/aashishrajput9838/academicuniverse.git') [37]. The content checksum ‘17c136ef76dd0f82' (SHA-256) is used to uniquely identify the synthetic benchmark dataset ‘AU_DIC_Benchmark_v1.0'. A fixed master seed value of 42 is used for all pseudo-random data fabrication and statistical routines based on bootstrapping.</w:t>
+        <w:t>To facilitate independent scientific verification and benchmark replication, all code, benchmark configurations, and evaluation artifacts are preserved under open-access version control. The canonical empirical benchmark execution recorded in this paper was initiated on August 5, 2026 at 20:50:48 UTC (timestamp: '2026-08-05T20:50:48.067Z', total execution duration: 3874.16s / 64.57 mins) under run identifier 'run_1785959173886'. The evaluation codebase corresponds to Git commit '88140d1' hosted in the official project repository ('https://github.com/aashishrajput9838/academicuniverse.git') [37]. The content checksum ‘17c136ef76dd0f82' (SHA-256) is used to uniquely identify the synthetic benchmark dataset ‘AU DIC Benchmark v1.0'. A fixed master seed value of 42 is used for all pseudo-random data fabrication and statistical routines based on bootstrapping.</w:t>
       </w:r>
     </w:p>
     <w:p>
@@ -25838,7 +25838,7 @@
           <w:szCs w:val="20"/>
           <w:rtl w:val="0"/>
         </w:rPr>
-        <w:t>As evidenced by the narrow 95% bootstrap confidence intervals across all primary evaluation metrics reported in Table 11, the framework demonstrates consistent statistical reproducibility. The nine-class diagnostic OCR error taxonomy distribution shift detailed in Table 12 evaluates 9,000 atomic field observations across the 450 synthetic multi-modal document specimens. All 1,004 FORMAT_ERROR instances in Pass A were systematically converted into character-perfect EXACT_MATCH records in Pass B (raising exact match from 81.77% to 92.92%), while 85 genuine NORMALIZATION_ERROR cases (9.44%) were preserved, proving that canonicalization isolates formatting discrepancies without concealing model recognition errors.</w:t>
+        <w:t>As evidenced by the narrow 95% bootstrap confidence intervals across all primary evaluation metrics reported in Table 11, the framework demonstrates consistent statistical reproducibility. The nine-class diagnostic OCR error taxonomy distribution shift detailed in Table 12 evaluates 9,000 atomic field observations across the 450 synthetic multi-modal document specimens. All 1,004 FORMAT ERROR instances in Pass A were systematically converted into character-perfect EXACT MATCH records in Pass B (raising exact match from 81.77% to 92.92%), while 85 genuine NORMALIZATION ERROR cases (9.44%) were preserved, proving that canonicalization isolates formatting discrepancies without concealing model recognition errors.</w:t>
       </w:r>
     </w:p>
     <w:p>
@@ -26179,7 +26179,7 @@
                 <w:szCs w:val="16"/>
                 <w:rtl w:val="0"/>
               </w:rPr>
-              <w:t xml:space="preserve">EXACT_MATCH</w:t>
+              <w:t>EXACT MATCH</w:t>
             </w:r>
             <w:r>
               <w:rPr>
@@ -26414,7 +26414,7 @@
                 <w:szCs w:val="16"/>
                 <w:rtl w:val="0"/>
               </w:rPr>
-              <w:t xml:space="preserve">FORMAT_ERROR</w:t>
+              <w:t>FORMAT ERROR</w:t>
             </w:r>
             <w:r>
               <w:rPr>
@@ -26649,7 +26649,7 @@
                 <w:szCs w:val="16"/>
                 <w:rtl w:val="0"/>
               </w:rPr>
-              <w:t xml:space="preserve">NORMALIZATION_ERROR</w:t>
+              <w:t>NORMALIZATION ERROR</w:t>
             </w:r>
             <w:r>
               <w:rPr>
@@ -26884,7 +26884,7 @@
                 <w:szCs w:val="16"/>
                 <w:rtl w:val="0"/>
               </w:rPr>
-              <w:t xml:space="preserve">OCR_ERROR</w:t>
+              <w:t>OCR ERROR</w:t>
             </w:r>
             <w:r>
               <w:rPr>
@@ -27119,7 +27119,7 @@
                 <w:szCs w:val="16"/>
                 <w:rtl w:val="0"/>
               </w:rPr>
-              <w:t xml:space="preserve">FIELD_MISSING</w:t>
+              <w:t>FIELD MISSING</w:t>
             </w:r>
             <w:r>
               <w:rPr>
@@ -27589,7 +27589,7 @@
                 <w:szCs w:val="16"/>
                 <w:rtl w:val="0"/>
               </w:rPr>
-              <w:t xml:space="preserve">CATEGORY_ERROR</w:t>
+              <w:t>CATEGORY ERROR</w:t>
             </w:r>
             <w:r>
               <w:rPr>
@@ -27824,7 +27824,7 @@
                 <w:szCs w:val="16"/>
                 <w:rtl w:val="0"/>
               </w:rPr>
-              <w:t xml:space="preserve">PARTIAL_MATCH</w:t>
+              <w:t>PARTIAL MATCH</w:t>
             </w:r>
             <w:r>
               <w:rPr>
@@ -28059,7 +28059,7 @@
                 <w:szCs w:val="16"/>
                 <w:rtl w:val="0"/>
               </w:rPr>
-              <w:t xml:space="preserve">LOW_CONFIDENCE</w:t>
+              <w:t>LOW CONFIDENCE</w:t>
             </w:r>
             <w:r>
               <w:rPr>
@@ -32646,7 +32646,7 @@
           <w:szCs w:val="20"/>
           <w:rtl w:val="0"/>
         </w:rPr>
-        <w:t xml:space="preserve">One of the classes is EXACT_MATCH:Unnormalized exact string equality (y == y_hat). </w:t>
+        <w:t xml:space="preserve">1. EXACT MATCH: Unnormalized exact string equality (y == y_hat). </w:t>
       </w:r>
     </w:p>
     <w:p>
@@ -32666,7 +32666,7 @@
           <w:szCs w:val="20"/>
           <w:rtl w:val="0"/>
         </w:rPr>
-        <w:t xml:space="preserve">2. FORMAT_ERROR:Unnormalized strings differ (y!=y_hat) but canonical representations match identically (N(y) == N(y_hat)). </w:t>
+        <w:t xml:space="preserve">2. FORMAT ERROR: Unnormalized strings differ (y!=y_hat) but canonical representations match identically (N(y) == N(y_hat)). </w:t>
       </w:r>
     </w:p>
     <w:p>
@@ -32686,7 +32686,7 @@
           <w:szCs w:val="20"/>
           <w:rtl w:val="0"/>
         </w:rPr>
-        <w:t xml:space="preserve">3. NORMALIZATION_ERROR: Canonical representations are not equal (N(y) != N(y_hat)), but there is some overlap in characters (0.5 &lt;= LevSim &lt; 1.0). Smart Academic Document Intelligence &amp; Benchmarking </w:t>
+        <w:t xml:space="preserve">3. NORMALIZATION ERROR: Canonical representations are not equal (N(y) != N(y_hat)), but there is some overlap in characters (0.5 &lt;= LevSim &lt; 1.0). Smart Academic Document Intelligence &amp; Benchmarking </w:t>
       </w:r>
     </w:p>
     <w:p>
@@ -32706,7 +32706,7 @@
           <w:szCs w:val="20"/>
           <w:rtl w:val="0"/>
         </w:rPr>
-        <w:t xml:space="preserve">4. OCR_ERROR:Character substitutions, deletions or insertions that are directly caused by optical scanner noise. </w:t>
+        <w:t xml:space="preserve">4. OCR ERROR: Character substitutions, deletions or insertions that are directly caused by optical scanner noise. </w:t>
       </w:r>
     </w:p>
     <w:p>
@@ -32726,7 +32726,7 @@
           <w:szCs w:val="20"/>
           <w:rtl w:val="0"/>
         </w:rPr>
-        <w:t xml:space="preserve">5. FIELD_MISSING: The key of the targeted entity is not included in the structured JSON output of the model (y_hat = empty). </w:t>
+        <w:t xml:space="preserve">5. FIELD MISSING: The key of the targeted entity is not included in the structured JSON output of the model (y_hat = empty). </w:t>
       </w:r>
     </w:p>
     <w:p>
@@ -32766,7 +32766,7 @@
           <w:szCs w:val="20"/>
           <w:rtl w:val="0"/>
         </w:rPr>
-        <w:t xml:space="preserve">7. CATEGORY_ERROR: There is a mismatch in document category classification in the ground truth and prediction. </w:t>
+        <w:t xml:space="preserve">7. CATEGORY ERROR: There is a mismatch in document category classification in the ground truth and prediction. </w:t>
       </w:r>
     </w:p>
     <w:p>
@@ -32786,7 +32786,7 @@
           <w:szCs w:val="20"/>
           <w:rtl w:val="0"/>
         </w:rPr>
-        <w:t xml:space="preserve">Partial_MATCH: Extracted string is a strict sub-phrase or truncated fragment of the reference entity in range (0 &lt; LevSim &lt; 0.5). </w:t>
+        <w:t xml:space="preserve">8. PARTIAL MATCH: Extracted string is a strict sub-phrase or truncated fragment of the reference entity in range (0 &lt; LevSim &lt; 0.5). </w:t>
       </w:r>
     </w:p>
     <w:p>
@@ -32806,7 +32806,7 @@
           <w:szCs w:val="20"/>
           <w:rtl w:val="0"/>
         </w:rPr>
-        <w:t xml:space="preserve">9. LOW_CONFIDENCE: Prediction of extracted field from the calibrated model is less than the confidence threshold (tau &lt; 0.50). </w:t>
+        <w:t xml:space="preserve">9. LOW CONFIDENCE: Prediction of extracted field from the calibrated model is less than the confidence threshold (tau &lt; 0.50). </w:t>
       </w:r>
     </w:p>
     <w:p>

</xml_diff>